<commit_message>
almost there for 376 essay
</commit_message>
<xml_diff>
--- a/376/Social media ban for children.docx
+++ b/376/Social media ban for children.docx
@@ -12,6 +12,74 @@
         <w:rPr>
           <w:lang w:val="en-US"/>
         </w:rPr>
+        <w:t>“</w:t>
+      </w:r>
+      <w:r>
+        <w:rPr>
+          <w:lang w:val="en-US"/>
+        </w:rPr>
+        <w:t>Addiction is a treatable, chronic medical disease involving complex interactions among brain circuits, genetics, the environment, and an individual’s life experiences. People with addiction use substances or engage in behaviors that become compulsive and often continue despite harmful consequences</w:t>
+      </w:r>
+      <w:r>
+        <w:rPr>
+          <w:lang w:val="en-US"/>
+        </w:rPr>
+        <w:t>” []</w:t>
+      </w:r>
+    </w:p>
+    <w:p>
+      <w:pPr>
+        <w:rPr>
+          <w:lang w:val="en-US"/>
+        </w:rPr>
+      </w:pPr>
+      <w:r>
+        <w:rPr>
+          <w:lang w:val="en-US"/>
+        </w:rPr>
+        <w:t>Addiction is a very serious problem in lots of parts of the world</w:t>
+      </w:r>
+      <w:r>
+        <w:rPr>
+          <w:lang w:val="en-US"/>
+        </w:rPr>
+        <w:t>. I</w:t>
+      </w:r>
+      <w:r>
+        <w:rPr>
+          <w:lang w:val="en-US"/>
+        </w:rPr>
+        <w:t>n Vancouver Canada</w:t>
+      </w:r>
+      <w:r>
+        <w:rPr>
+          <w:lang w:val="en-US"/>
+        </w:rPr>
+        <w:t>, on the lower east side addiction has been called an epidemic, specifically o</w:t>
+      </w:r>
+      <w:r>
+        <w:rPr>
+          <w:lang w:val="en-US"/>
+        </w:rPr>
+        <w:t xml:space="preserve">pioid addiction has been </w:t>
+      </w:r>
+      <w:r>
+        <w:rPr>
+          <w:lang w:val="en-US"/>
+        </w:rPr>
+        <w:t>wreaking havoc on the local community.</w:t>
+      </w:r>
+    </w:p>
+    <w:p>
+      <w:pPr>
+        <w:rPr>
+          <w:lang w:val="en-US"/>
+        </w:rPr>
+      </w:pPr>
+      <w:r>
+        <w:rPr>
+          <w:lang w:val="en-US"/>
+        </w:rPr>
         <w:t xml:space="preserve">Currently social media runs of a very strange business model. Social media current model is to maximize engagement []. They do this because they can sell the data gathered from you to advertisers. A general business model is </w:t>
       </w:r>
       <w:proofErr w:type="gramStart"/>
@@ -268,114 +336,304 @@
         <w:rPr>
           <w:lang w:val="en-US"/>
         </w:rPr>
-        <w:t xml:space="preserve">This line becomes even more blurred when we consider drugs and alcohol. Some countries prohibit the consumption </w:t>
+        <w:t xml:space="preserve">This line becomes even more blurred when we consider drugs and alcohol. Some countries prohibit the consumption on </w:t>
       </w:r>
       <w:proofErr w:type="gramStart"/>
       <w:r>
         <w:rPr>
           <w:lang w:val="en-US"/>
         </w:rPr>
-        <w:t>on</w:t>
+        <w:t>alcohol</w:t>
       </w:r>
       <w:proofErr w:type="gramEnd"/>
       <w:r>
         <w:rPr>
           <w:lang w:val="en-US"/>
         </w:rPr>
-        <w:t xml:space="preserve"> </w:t>
+        <w:t xml:space="preserve"> and some do not. </w:t>
+      </w:r>
+      <w:r>
+        <w:rPr>
+          <w:lang w:val="en-US"/>
+        </w:rPr>
+        <w:t>Both the USA and Canada prohibited alcohol at points throughout their history</w:t>
+      </w:r>
+      <w:r>
+        <w:rPr>
+          <w:lang w:val="en-US"/>
+        </w:rPr>
+        <w:t xml:space="preserve"> []</w:t>
+      </w:r>
+      <w:r>
+        <w:rPr>
+          <w:lang w:val="en-US"/>
+        </w:rPr>
+        <w:t xml:space="preserve">. This back and forth of letting people do something that might hurt them without restricting a person basic right of free will is </w:t>
+      </w:r>
+      <w:r>
+        <w:rPr>
+          <w:lang w:val="en-US"/>
+        </w:rPr>
+        <w:lastRenderedPageBreak/>
+        <w:t>prevalent in lots of discussions. Should hard drugs be illegal to use? Should tobacco be illegal? Should gambling be illegal? Should marijuana be illegal?</w:t>
+      </w:r>
+    </w:p>
+    <w:p>
+      <w:pPr>
+        <w:rPr>
+          <w:lang w:val="en-US"/>
+        </w:rPr>
+      </w:pPr>
+      <w:r>
+        <w:rPr>
+          <w:lang w:val="en-US"/>
+        </w:rPr>
+        <w:t xml:space="preserve">These arguments of free will vs protecting people changes significantly when the people that are being protected are minors or children. The answer to </w:t>
       </w:r>
       <w:proofErr w:type="gramStart"/>
       <w:r>
         <w:rPr>
           <w:lang w:val="en-US"/>
         </w:rPr>
-        <w:t>alcohol</w:t>
+        <w:t>all of</w:t>
       </w:r>
       <w:proofErr w:type="gramEnd"/>
       <w:r>
         <w:rPr>
           <w:lang w:val="en-US"/>
         </w:rPr>
-        <w:t xml:space="preserve"> and some do not. </w:t>
-      </w:r>
-      <w:r>
-        <w:rPr>
-          <w:lang w:val="en-US"/>
-        </w:rPr>
-        <w:t>Both the USA and Canada prohibited alcohol at points throughout their history</w:t>
-      </w:r>
-      <w:r>
-        <w:rPr>
-          <w:lang w:val="en-US"/>
-        </w:rPr>
-        <w:t xml:space="preserve"> []</w:t>
-      </w:r>
-      <w:r>
-        <w:rPr>
-          <w:lang w:val="en-US"/>
-        </w:rPr>
-        <w:t>. This back and forth of letting people do something that might hurt them without restricting a person basic right of free will is prevalent in lots of discussions. Should hard drugs be illegal to use? Should tobacco be illegal? Should gambling be illegal? Should marijuana be illegal?</w:t>
-      </w:r>
-    </w:p>
-    <w:p>
-      <w:pPr>
-        <w:rPr>
-          <w:lang w:val="en-US"/>
-        </w:rPr>
-      </w:pPr>
-      <w:r>
-        <w:rPr>
-          <w:lang w:val="en-US"/>
-        </w:rPr>
-        <w:t xml:space="preserve">These arguments of free will vs protecting people </w:t>
+        <w:t xml:space="preserve"> the questions above, should x be illegal, were yes if you are a minor in Canada []. </w:t>
+      </w:r>
+      <w:r>
+        <w:rPr>
+          <w:lang w:val="en-US"/>
+        </w:rPr>
+        <w:t xml:space="preserve">Children don’t have fully developed frontal lobes, the part of the brain the regulates decision making []. For this </w:t>
       </w:r>
       <w:proofErr w:type="gramStart"/>
       <w:r>
         <w:rPr>
           <w:lang w:val="en-US"/>
         </w:rPr>
-        <w:t>changes</w:t>
+        <w:t>reason</w:t>
       </w:r>
       <w:proofErr w:type="gramEnd"/>
       <w:r>
         <w:rPr>
           <w:lang w:val="en-US"/>
         </w:rPr>
-        <w:t xml:space="preserve"> significantly when the people that are being protected are minors or children. The answer to </w:t>
+        <w:t xml:space="preserve"> drugs are and other addictive things are often illegal for children to use.</w:t>
+      </w:r>
+    </w:p>
+    <w:p>
+      <w:pPr>
+        <w:rPr>
+          <w:lang w:val="en-US"/>
+        </w:rPr>
+      </w:pPr>
+      <w:r>
+        <w:rPr>
+          <w:lang w:val="en-US"/>
+        </w:rPr>
+        <w:t xml:space="preserve">In Canada the laws have made it clear that we allow adults to do things that could potentially harm selves. If your act will potentially harm </w:t>
       </w:r>
       <w:proofErr w:type="gramStart"/>
       <w:r>
         <w:rPr>
           <w:lang w:val="en-US"/>
         </w:rPr>
-        <w:t>all of</w:t>
+        <w:t>another</w:t>
       </w:r>
       <w:proofErr w:type="gramEnd"/>
       <w:r>
         <w:rPr>
           <w:lang w:val="en-US"/>
         </w:rPr>
-        <w:t xml:space="preserve"> the questions above, should x be illegal, were yes if you are a minor in Canada []. </w:t>
-      </w:r>
-      <w:r>
-        <w:rPr>
-          <w:lang w:val="en-US"/>
-        </w:rPr>
-        <w:t xml:space="preserve">Children don’t have fully developed frontal lobes, the part of the brain the regulates decision making []. For this </w:t>
+        <w:t xml:space="preserve"> is it not ok. It is illegal to drive drunk, because you are putting other in unnecessary danger. You are allowed to be drunk, but that drunkenness can not put others in harms way. You are allowed to smoke tobacco, but there are now rules where you can smoke in order to protect those that would be harm by the </w:t>
       </w:r>
       <w:proofErr w:type="gramStart"/>
       <w:r>
         <w:rPr>
           <w:lang w:val="en-US"/>
         </w:rPr>
-        <w:t>reason</w:t>
+        <w:t>second hand</w:t>
       </w:r>
       <w:proofErr w:type="gramEnd"/>
       <w:r>
         <w:rPr>
           <w:lang w:val="en-US"/>
         </w:rPr>
-        <w:t xml:space="preserve"> drugs are and other addictive things are often illegal for children to use.</w:t>
+        <w:t xml:space="preserve"> smoke. Adults are allowed to gamble, gambling breaks the trend harming others, </w:t>
+      </w:r>
+      <w:r>
+        <w:rPr>
+          <w:lang w:val="en-US"/>
+        </w:rPr>
+        <w:t>if you lose all your money gambling there are no laws stopping you, even if you are responsible for minor.</w:t>
+      </w:r>
+    </w:p>
+    <w:p>
+      <w:pPr>
+        <w:rPr>
+          <w:lang w:val="en-US"/>
+        </w:rPr>
+      </w:pPr>
+      <w:r>
+        <w:rPr>
+          <w:lang w:val="en-US"/>
+        </w:rPr>
+        <w:t xml:space="preserve">This leads us to the topic of social </w:t>
+      </w:r>
+      <w:proofErr w:type="gramStart"/>
+      <w:r>
+        <w:rPr>
+          <w:lang w:val="en-US"/>
+        </w:rPr>
+        <w:t>media,</w:t>
+      </w:r>
+      <w:proofErr w:type="gramEnd"/>
+      <w:r>
+        <w:rPr>
+          <w:lang w:val="en-US"/>
+        </w:rPr>
+        <w:t xml:space="preserve"> it has the potential to cause harm to the person using it. Should it be illegal? </w:t>
+      </w:r>
+      <w:r>
+        <w:rPr>
+          <w:lang w:val="en-US"/>
+        </w:rPr>
+        <w:t>There is a debate that is maybe it should be.</w:t>
+      </w:r>
+      <w:r>
+        <w:rPr>
+          <w:lang w:val="en-US"/>
+        </w:rPr>
+        <w:t xml:space="preserve"> The debate is strongest when it is considering if we should ban social media for minors. But I would like to debate a broader point. Any business that users are the product should </w:t>
+      </w:r>
+      <w:r>
+        <w:rPr>
+          <w:lang w:val="en-US"/>
+        </w:rPr>
+        <w:t xml:space="preserve">not be illegal for minors to use. That is a business </w:t>
+      </w:r>
+      <w:proofErr w:type="gramStart"/>
+      <w:r>
+        <w:rPr>
+          <w:lang w:val="en-US"/>
+        </w:rPr>
+        <w:t>who’s</w:t>
+      </w:r>
+      <w:proofErr w:type="gramEnd"/>
+      <w:r>
+        <w:rPr>
+          <w:lang w:val="en-US"/>
+        </w:rPr>
+        <w:t xml:space="preserve"> revenue is more than 50% driven by data sold to third parties should be illegal for minors to use. </w:t>
+      </w:r>
+    </w:p>
+    <w:p>
+      <w:pPr>
+        <w:rPr>
+          <w:lang w:val="en-US"/>
+        </w:rPr>
+      </w:pPr>
+      <w:r>
+        <w:rPr>
+          <w:lang w:val="en-US"/>
+        </w:rPr>
+        <w:t xml:space="preserve">I am not saying that there are not problems with tobacco and alcohol. But theoretically a minor could buy these products and not use them, thus not harming them. The alcohol and tobacco companies would not care too much if they weren’t used, they would still be happy that they made a sale. Gambling and streaming services like Netflix are closer to being a problem. </w:t>
+      </w:r>
+    </w:p>
+    <w:p>
+      <w:pPr>
+        <w:rPr>
+          <w:lang w:val="en-US"/>
+        </w:rPr>
+      </w:pPr>
+      <w:r>
+        <w:rPr>
+          <w:lang w:val="en-US"/>
+        </w:rPr>
+        <w:t xml:space="preserve">Netflix might be selling the data gathered, but they theoretically only care that you keep your subscription, they don’t care if you don’t </w:t>
+      </w:r>
+      <w:proofErr w:type="gramStart"/>
+      <w:r>
+        <w:rPr>
+          <w:lang w:val="en-US"/>
+        </w:rPr>
+        <w:t>actually watch</w:t>
+      </w:r>
+      <w:proofErr w:type="gramEnd"/>
+      <w:r>
+        <w:rPr>
+          <w:lang w:val="en-US"/>
+        </w:rPr>
+        <w:t xml:space="preserve"> anything. Netflix has its own problems of trying to keep users engaged </w:t>
+      </w:r>
+      <w:r>
+        <w:rPr>
+          <w:lang w:val="en-US"/>
+        </w:rPr>
+        <w:t xml:space="preserve">like automatically playing the next episode. But they are less incentivized to make their product addictive because their revenue is not entirely or close to entirely based on their users using their products. </w:t>
+      </w:r>
+    </w:p>
+    <w:p>
+      <w:pPr>
+        <w:rPr>
+          <w:lang w:val="en-US"/>
+        </w:rPr>
+      </w:pPr>
+      <w:r>
+        <w:rPr>
+          <w:lang w:val="en-US"/>
+        </w:rPr>
+        <w:t xml:space="preserve">Gambling has a large problem with addiction. In Ontario you can put yourself on a </w:t>
+      </w:r>
+    </w:p>
+    <w:p>
+      <w:pPr>
+        <w:rPr>
+          <w:lang w:val="en-US"/>
+        </w:rPr>
+      </w:pPr>
+      <w:r>
+        <w:rPr>
+          <w:lang w:val="en-US"/>
+        </w:rPr>
+        <w:t xml:space="preserve">Just like gambling, tobacco, alcohol, and marijuana </w:t>
+      </w:r>
+      <w:r>
+        <w:rPr>
+          <w:lang w:val="en-US"/>
+        </w:rPr>
+        <w:t xml:space="preserve">social media can be addictive. </w:t>
+      </w:r>
+    </w:p>
+    <w:p>
+      <w:pPr>
+        <w:rPr>
+          <w:lang w:val="en-US"/>
+        </w:rPr>
+      </w:pPr>
+    </w:p>
+    <w:p>
+      <w:pPr>
+        <w:rPr>
+          <w:lang w:val="en-US"/>
+        </w:rPr>
+      </w:pPr>
+    </w:p>
+    <w:p>
+      <w:pPr>
+        <w:rPr>
+          <w:lang w:val="en-US"/>
+        </w:rPr>
+      </w:pPr>
+      <w:r>
+        <w:rPr>
+          <w:lang w:val="en-US"/>
+        </w:rPr>
+        <w:br w:type="page"/>
       </w:r>
     </w:p>
     <w:p>
@@ -389,317 +647,7 @@
           <w:lang w:val="en-US"/>
         </w:rPr>
         <w:lastRenderedPageBreak/>
-        <w:t xml:space="preserve">In Canada the laws have made it clear that we allow adults to do things that could potentially harm selves. If your act will potentially harm </w:t>
-      </w:r>
-      <w:proofErr w:type="gramStart"/>
-      <w:r>
-        <w:rPr>
-          <w:lang w:val="en-US"/>
-        </w:rPr>
-        <w:t>another</w:t>
-      </w:r>
-      <w:proofErr w:type="gramEnd"/>
-      <w:r>
-        <w:rPr>
-          <w:lang w:val="en-US"/>
-        </w:rPr>
-        <w:t xml:space="preserve"> is it not ok. It is illegal to drive drunk, because you are putting </w:t>
-      </w:r>
-      <w:proofErr w:type="gramStart"/>
-      <w:r>
-        <w:rPr>
-          <w:lang w:val="en-US"/>
-        </w:rPr>
-        <w:t>other</w:t>
-      </w:r>
-      <w:proofErr w:type="gramEnd"/>
-      <w:r>
-        <w:rPr>
-          <w:lang w:val="en-US"/>
-        </w:rPr>
-        <w:t xml:space="preserve"> in unnecessary danger. You are allowed to be drunk, but that drunkenness </w:t>
-      </w:r>
-      <w:proofErr w:type="gramStart"/>
-      <w:r>
-        <w:rPr>
-          <w:lang w:val="en-US"/>
-        </w:rPr>
-        <w:t>can not</w:t>
-      </w:r>
-      <w:proofErr w:type="gramEnd"/>
-      <w:r>
-        <w:rPr>
-          <w:lang w:val="en-US"/>
-        </w:rPr>
-        <w:t xml:space="preserve"> put others in harms way. You are allowed to smoke tobacco, but there are now rules where you can smoke in order to protect those that would be </w:t>
-      </w:r>
-      <w:proofErr w:type="gramStart"/>
-      <w:r>
-        <w:rPr>
-          <w:lang w:val="en-US"/>
-        </w:rPr>
-        <w:t>harm</w:t>
-      </w:r>
-      <w:proofErr w:type="gramEnd"/>
-      <w:r>
-        <w:rPr>
-          <w:lang w:val="en-US"/>
-        </w:rPr>
-        <w:t xml:space="preserve"> by the </w:t>
-      </w:r>
-      <w:proofErr w:type="gramStart"/>
-      <w:r>
-        <w:rPr>
-          <w:lang w:val="en-US"/>
-        </w:rPr>
-        <w:t>second hand</w:t>
-      </w:r>
-      <w:proofErr w:type="gramEnd"/>
-      <w:r>
-        <w:rPr>
-          <w:lang w:val="en-US"/>
-        </w:rPr>
-        <w:t xml:space="preserve"> smoke. Adults are allowed to gamble, gambling breaks the trend harming others, </w:t>
-      </w:r>
-      <w:r>
-        <w:rPr>
-          <w:lang w:val="en-US"/>
-        </w:rPr>
-        <w:t>if you lose all your money gambling there are no laws stopping you, even if you are responsible for minor.</w:t>
-      </w:r>
-    </w:p>
-    <w:p>
-      <w:pPr>
-        <w:rPr>
-          <w:lang w:val="en-US"/>
-        </w:rPr>
-      </w:pPr>
-      <w:r>
-        <w:rPr>
-          <w:lang w:val="en-US"/>
-        </w:rPr>
-        <w:t xml:space="preserve">This leads us to the topic of social </w:t>
-      </w:r>
-      <w:proofErr w:type="gramStart"/>
-      <w:r>
-        <w:rPr>
-          <w:lang w:val="en-US"/>
-        </w:rPr>
-        <w:t>media,</w:t>
-      </w:r>
-      <w:proofErr w:type="gramEnd"/>
-      <w:r>
-        <w:rPr>
-          <w:lang w:val="en-US"/>
-        </w:rPr>
-        <w:t xml:space="preserve"> it has the potential to cause harm to the person using it. Should it be illegal? </w:t>
-      </w:r>
-      <w:r>
-        <w:rPr>
-          <w:lang w:val="en-US"/>
-        </w:rPr>
-        <w:t xml:space="preserve">There is a debate </w:t>
-      </w:r>
-      <w:proofErr w:type="gramStart"/>
-      <w:r>
-        <w:rPr>
-          <w:lang w:val="en-US"/>
-        </w:rPr>
-        <w:t>that is</w:t>
-      </w:r>
-      <w:proofErr w:type="gramEnd"/>
-      <w:r>
-        <w:rPr>
-          <w:lang w:val="en-US"/>
-        </w:rPr>
-        <w:t xml:space="preserve"> maybe it should be.</w:t>
-      </w:r>
-      <w:r>
-        <w:rPr>
-          <w:lang w:val="en-US"/>
-        </w:rPr>
-        <w:t xml:space="preserve"> The debate is strongest when it is considering if we should ban social media for minors. But I would like to debate a broader point. Any business that users are the product should </w:t>
-      </w:r>
-      <w:r>
-        <w:rPr>
-          <w:lang w:val="en-US"/>
-        </w:rPr>
-        <w:t xml:space="preserve">not be illegal for minors to use. That is a business </w:t>
-      </w:r>
-      <w:proofErr w:type="gramStart"/>
-      <w:r>
-        <w:rPr>
-          <w:lang w:val="en-US"/>
-        </w:rPr>
-        <w:t>who’s</w:t>
-      </w:r>
-      <w:proofErr w:type="gramEnd"/>
-      <w:r>
-        <w:rPr>
-          <w:lang w:val="en-US"/>
-        </w:rPr>
-        <w:t xml:space="preserve"> revenue is more than 50% driven by data sold to third parties should be illegal for minors to use. </w:t>
-      </w:r>
-    </w:p>
-    <w:p>
-      <w:pPr>
-        <w:rPr>
-          <w:lang w:val="en-US"/>
-        </w:rPr>
-      </w:pPr>
-      <w:r>
-        <w:rPr>
-          <w:lang w:val="en-US"/>
-        </w:rPr>
-        <w:t xml:space="preserve">I am not saying that there are </w:t>
-      </w:r>
-      <w:proofErr w:type="gramStart"/>
-      <w:r>
-        <w:rPr>
-          <w:lang w:val="en-US"/>
-        </w:rPr>
-        <w:t>not</w:t>
-      </w:r>
-      <w:proofErr w:type="gramEnd"/>
-      <w:r>
-        <w:rPr>
-          <w:lang w:val="en-US"/>
-        </w:rPr>
-        <w:t xml:space="preserve"> problems with tobacco and alcohol. But theoretically a minor could buy these products and not use them, thus not harming them. The alcohol and tobacco companies would not care too much if they weren’t used, they would still be happy that they made a sale. Gambling and streaming services like Netflix are closer to being a problem. </w:t>
-      </w:r>
-    </w:p>
-    <w:p>
-      <w:pPr>
-        <w:rPr>
-          <w:lang w:val="en-US"/>
-        </w:rPr>
-      </w:pPr>
-      <w:r>
-        <w:rPr>
-          <w:lang w:val="en-US"/>
-        </w:rPr>
-        <w:t xml:space="preserve">Netflix might be selling the data gathered, but they theoretically only care that you keep your subscription, they don’t care if you don’t </w:t>
-      </w:r>
-      <w:proofErr w:type="gramStart"/>
-      <w:r>
-        <w:rPr>
-          <w:lang w:val="en-US"/>
-        </w:rPr>
-        <w:t>actually watch</w:t>
-      </w:r>
-      <w:proofErr w:type="gramEnd"/>
-      <w:r>
-        <w:rPr>
-          <w:lang w:val="en-US"/>
-        </w:rPr>
-        <w:t xml:space="preserve"> anything. Netflix has its own problems of trying to keep users engaged </w:t>
-      </w:r>
-      <w:r>
-        <w:rPr>
-          <w:lang w:val="en-US"/>
-        </w:rPr>
-        <w:t xml:space="preserve">like automatically playing the next episode. But they are less incentivized to make their product addictive because their revenue is not entirely or close to entirely based on their users using their products. </w:t>
-      </w:r>
-    </w:p>
-    <w:p>
-      <w:pPr>
-        <w:rPr>
-          <w:lang w:val="en-US"/>
-        </w:rPr>
-      </w:pPr>
-      <w:r>
-        <w:rPr>
-          <w:lang w:val="en-US"/>
-        </w:rPr>
-        <w:t xml:space="preserve">Gambling has a large problem with addiction. In Ontario you can put yourself on a </w:t>
-      </w:r>
-    </w:p>
-    <w:p>
-      <w:pPr>
-        <w:rPr>
-          <w:lang w:val="en-US"/>
-        </w:rPr>
-      </w:pPr>
-      <w:r>
-        <w:rPr>
-          <w:lang w:val="en-US"/>
-        </w:rPr>
-        <w:t xml:space="preserve">Just like gambling, tobacco, alcohol, and </w:t>
-      </w:r>
-      <w:proofErr w:type="gramStart"/>
-      <w:r>
-        <w:rPr>
-          <w:lang w:val="en-US"/>
-        </w:rPr>
-        <w:t>marijuana</w:t>
-      </w:r>
-      <w:proofErr w:type="gramEnd"/>
-      <w:r>
-        <w:rPr>
-          <w:lang w:val="en-US"/>
-        </w:rPr>
-        <w:t xml:space="preserve"> </w:t>
-      </w:r>
-      <w:r>
-        <w:rPr>
-          <w:lang w:val="en-US"/>
-        </w:rPr>
-        <w:t xml:space="preserve">social media can be addictive. </w:t>
-      </w:r>
-    </w:p>
-    <w:p>
-      <w:pPr>
-        <w:rPr>
-          <w:lang w:val="en-US"/>
-        </w:rPr>
-      </w:pPr>
-    </w:p>
-    <w:p>
-      <w:pPr>
-        <w:rPr>
-          <w:lang w:val="en-US"/>
-        </w:rPr>
-      </w:pPr>
-    </w:p>
-    <w:p>
-      <w:pPr>
-        <w:rPr>
-          <w:lang w:val="en-US"/>
-        </w:rPr>
-      </w:pPr>
-      <w:r>
-        <w:rPr>
-          <w:lang w:val="en-US"/>
-        </w:rPr>
-        <w:br w:type="page"/>
-      </w:r>
-    </w:p>
-    <w:p>
-      <w:pPr>
-        <w:rPr>
-          <w:lang w:val="en-US"/>
-        </w:rPr>
-      </w:pPr>
-      <w:r>
-        <w:rPr>
-          <w:lang w:val="en-US"/>
-        </w:rPr>
-        <w:lastRenderedPageBreak/>
-        <w:t xml:space="preserve">All forms of entertainment can be addictive. We enjoy something so we want to experience it more. A problem occurs when entertainment is trying to be </w:t>
-      </w:r>
-      <w:proofErr w:type="gramStart"/>
-      <w:r>
-        <w:rPr>
-          <w:lang w:val="en-US"/>
-        </w:rPr>
-        <w:t>addictive</w:t>
-      </w:r>
-      <w:proofErr w:type="gramEnd"/>
-      <w:r>
-        <w:rPr>
-          <w:lang w:val="en-US"/>
-        </w:rPr>
-        <w:t xml:space="preserve"> not just as entertaining as possible. If your product is trying to provide entertainment, your goal should be to entertain thus getting your users to come back because they want to be entertained. Your goal should not be to get your users addicted and want them to spend all their time on your product, the goal is your user spends all their free time and excess money on your product or service.</w:t>
+        <w:t>All forms of entertainment can be addictive. We enjoy something so we want to experience it more. A problem occurs when entertainment is trying to be addictive not just as entertaining as possible. If your product is trying to provide entertainment, your goal should be to entertain thus getting your users to come back because they want to be entertained. Your goal should not be to get your users addicted and want them to spend all their time on your product, the goal is your user spends all their free time and excess money on your product or service.</w:t>
       </w:r>
     </w:p>
     <w:p>
@@ -1181,21 +1129,7 @@
         <w:rPr>
           <w:lang w:val="en-US"/>
         </w:rPr>
-        <w:t xml:space="preserve">if they were constantly </w:t>
-      </w:r>
-      <w:proofErr w:type="gramStart"/>
-      <w:r>
-        <w:rPr>
-          <w:lang w:val="en-US"/>
-        </w:rPr>
-        <w:t>playing</w:t>
-      </w:r>
-      <w:proofErr w:type="gramEnd"/>
-      <w:r>
-        <w:rPr>
-          <w:lang w:val="en-US"/>
-        </w:rPr>
-        <w:t xml:space="preserve"> </w:t>
+        <w:t xml:space="preserve">if they were constantly playing </w:t>
       </w:r>
       <w:r>
         <w:rPr>
@@ -1257,21 +1191,7 @@
         <w:rPr>
           <w:lang w:val="en-US"/>
         </w:rPr>
-        <w:t xml:space="preserve"> </w:t>
-      </w:r>
-      <w:proofErr w:type="gramStart"/>
-      <w:r>
-        <w:rPr>
-          <w:lang w:val="en-US"/>
-        </w:rPr>
-        <w:t>data</w:t>
-      </w:r>
-      <w:proofErr w:type="gramEnd"/>
-      <w:r>
-        <w:rPr>
-          <w:lang w:val="en-US"/>
-        </w:rPr>
-        <w:t xml:space="preserve"> if they did it would most likely be at the expense of a good product. This competing forces on incentives make sure google doesn’t make an addictive product.</w:t>
+        <w:t xml:space="preserve"> data if they did it would most likely be at the expense of a good product. This competing forces on incentives make sure google doesn’t make an addictive product.</w:t>
       </w:r>
     </w:p>
     <w:p>
@@ -1517,13 +1437,7 @@
         <w:rPr>
           <w:lang w:val="en-US"/>
         </w:rPr>
-        <w:t>ethical for a company product to be only financially incentivized to keep their users engaged with their product for an infinite amount of time</w:t>
-      </w:r>
-      <w:r>
-        <w:rPr>
-          <w:lang w:val="en-US"/>
-        </w:rPr>
-        <w:t>.</w:t>
+        <w:t>ethical for a company product to be only financially incentivized to keep their users engaged with their product for an infinite amount of time.</w:t>
       </w:r>
     </w:p>
     <w:p>
@@ -1690,21 +1604,7 @@
         <w:rPr>
           <w:lang w:val="en-US"/>
         </w:rPr>
-        <w:t xml:space="preserve">Casinos are wholly incentivized to keep their customers gambling as long as </w:t>
-      </w:r>
-      <w:proofErr w:type="gramStart"/>
-      <w:r>
-        <w:rPr>
-          <w:lang w:val="en-US"/>
-        </w:rPr>
-        <w:t>possible</w:t>
-      </w:r>
-      <w:proofErr w:type="gramEnd"/>
-      <w:r>
-        <w:rPr>
-          <w:lang w:val="en-US"/>
-        </w:rPr>
-        <w:t xml:space="preserve"> making them unethical. Most governments around the world recognize this and gambling is highly regulated</w:t>
+        <w:t>Casinos are wholly incentivized to keep their customers gambling as long as possible making them unethical. Most governments around the world recognize this and gambling is highly regulated</w:t>
       </w:r>
       <w:r>
         <w:rPr>
@@ -2464,6 +2364,7 @@
   <w:style w:type="character" w:default="1" w:styleId="DefaultParagraphFont">
     <w:name w:val="Default Paragraph Font"/>
     <w:uiPriority w:val="1"/>
+    <w:semiHidden/>
     <w:unhideWhenUsed/>
   </w:style>
   <w:style w:type="table" w:default="1" w:styleId="TableNormal">

</xml_diff>